<commit_message>
Add «ΠΑΝΤΑ MSRP» override; apply it to the three borderline items
OVERRIDES can now force a code to MSRP and ignore any customer SPA,
same effect as rule 2β, for items whose catalog category isn't
FR/RK/CA. Νίκος confirmed the three borderline lines from the 20/10
report belong in that group: SRB19BLY (rear cable manager, OU8),
GB4B1028TPI-1 (grounding bar, PC7), QAPP24BL (QuickNet blank panel,
FB8). All 54 report lines are now covered.

Checked that none of the existing override texts parse as the new
directive. Diff vs previous engine on the October inputs: exactly
these 3 lines move SPA -> MSRP, nothing else. test.js: 2924 rows,
890 changed, 23 ΓΙΑ_ΕΛΕΓΧΟ, tests and integrity pass; same in
Chromium. RULES V3.3 and team memo updated; demo rebuilt, no leaks.

Co-Authored-By: Claude Opus 5.5 <noreply@anthropic.com>
Claude-Session: https://claude.ai/code/session_01BzJGp7TZogkrcqXW4FbpaM
</commit_message>
<xml_diff>
--- a/docs/RULES_V3.3_Panduit_Τιμές.docx
+++ b/docs/RULES_V3.3_Panduit_Τιμές.docx
@@ -475,7 +475,7 @@
     </w:p>
     <w:p>
       <w:r>
-        <w:t>Πρώτα εφαρμόζονται τα φύλλα του ΠΑΡΑΜΕΤΡΟΙ: EOL_ΕΠΙΒΕΒΑΙΩΜΕΝΑ → κατευθείαν EOL · OVERRIDES → ό,τι λένε. Μετά:</w:t>
+        <w:t>Πρώτα εφαρμόζονται τα φύλλα του ΠΑΡΑΜΕΤΡΟΙ: EOL_ΕΠΙΒΕΒΑΙΩΜΕΝΑ → κατευθείαν EOL · OVERRIDES → ό,τι λένε («πακέτο = N», «μονάδα = N», «ΑΠΟΔΟΧΗ ΑΠΟΚΛΙΣΗΣ», «ΠΑΝΤΑ MSRP»). Μετά:</w:t>
       </w:r>
     </w:p>
     <w:p>
@@ -2273,7 +2273,7 @@
         <w:pStyle w:val="ListBullet"/>
       </w:pPr>
       <w:r>
-        <w:t>Μένουν ανοιχτά 3 οριακά, γιατί η κατηγορία τους δεν είναι rack: SRB19BLY (πίσω οδηγός καλωδίων, OU8, μαζί με τα κενά patch panel), GB4B1028TPI-1 (μπάρα γείωσης, PC7), QAPP24BL (κενό patch panel QuickNet, FB8). Περιμένουν απόφαση Νίκου.</w:t>
+        <w:t>Νέα εντολή στο OVERRIDES: «ΠΑΝΤΑ MSRP». Ο κωδικός δεν παίρνει ποτέ SPA πελάτη, όπως στον κανόνα 2β, ανεξάρτητα από λέξη ή κατηγορία. Μπήκε για τα 3 οριακά του report που η κατηγορία τους δεν είναι rack: SRB19BLY (πίσω οδηγός καλωδίων, OU8), GB4B1028TPI-1 (μπάρα γείωσης, PC7), QAPP24BL (κενό patch panel QuickNet, FB8). Απόφαση Νίκου 27/10/2026. Και τα 54 του report καλύπτονται πλέον.</w:t>
       </w:r>
     </w:p>
     <w:p>

</xml_diff>